<commit_message>
WIP alpha schema change completed
</commit_message>
<xml_diff>
--- a/Reqs/2026/Feature Review and Bug Tracking Log - v2026.docx
+++ b/Reqs/2026/Feature Review and Bug Tracking Log - v2026.docx
@@ -241,7 +241,12 @@
         </w:numPr>
         <w:bidi w:val="0"/>
         <w:jc w:val="start"/>
-        <w:rPr/>
+        <w:rPr>
+          <w:rStyle w:val="Strong"/>
+          <w:rFonts w:ascii="Liberation Sans" w:hAnsi="Liberation Sans"/>
+          <w:b w:val="false"/>
+          <w:bCs w:val="false"/>
+        </w:rPr>
       </w:pPr>
       <w:r>
         <w:rPr>
@@ -313,7 +318,7 @@
           <w:b w:val="false"/>
           <w:bCs w:val="false"/>
         </w:rPr>
-        <w:t>ScanPoints</w:t>
+        <w:t>ScanCoin</w:t>
       </w:r>
     </w:p>
     <w:p>

</xml_diff>